<commit_message>
Release v4.2 Government Dossier Pack
</commit_message>
<xml_diff>
--- a/Tài liệu hướng dẫn sử dụng ứng dụng Quản lý hồ sơ cấp độ.docx
+++ b/Tài liệu hướng dẫn sử dụng ứng dụng Quản lý hồ sơ cấp độ.docx
@@ -1984,7 +1984,7 @@
     <w:p>
       <w:r>
         <w:pict w14:anchorId="5F4B8E13">
-          <v:rect id="_x0000_i1193" style="width:0;height:1.5pt" o:hralign="center" o:hrstd="t" o:hr="t" fillcolor="#a0a0a0" stroked="f"/>
+          <v:rect id="_x0000_i1025" style="width:0;height:1.5pt" o:hralign="center" o:hrstd="t" o:hr="t" fillcolor="#a0a0a0" stroked="f"/>
         </w:pict>
       </w:r>
     </w:p>
@@ -2108,7 +2108,7 @@
     <w:p>
       <w:r>
         <w:pict w14:anchorId="70964751">
-          <v:rect id="_x0000_i1194" style="width:0;height:1.5pt" o:hralign="center" o:hrstd="t" o:hr="t" fillcolor="#a0a0a0" stroked="f"/>
+          <v:rect id="_x0000_i1026" style="width:0;height:1.5pt" o:hralign="center" o:hrstd="t" o:hr="t" fillcolor="#a0a0a0" stroked="f"/>
         </w:pict>
       </w:r>
     </w:p>
@@ -2229,7 +2229,7 @@
     <w:p>
       <w:r>
         <w:pict w14:anchorId="503AD527">
-          <v:rect id="_x0000_i1195" style="width:0;height:1.5pt" o:hralign="center" o:hrstd="t" o:hr="t" fillcolor="#a0a0a0" stroked="f"/>
+          <v:rect id="_x0000_i1027" style="width:0;height:1.5pt" o:hralign="center" o:hrstd="t" o:hr="t" fillcolor="#a0a0a0" stroked="f"/>
         </w:pict>
       </w:r>
     </w:p>
@@ -2344,7 +2344,7 @@
     <w:p>
       <w:r>
         <w:pict w14:anchorId="7C101434">
-          <v:rect id="_x0000_i1196" style="width:0;height:1.5pt" o:hralign="center" o:hrstd="t" o:hr="t" fillcolor="#a0a0a0" stroked="f"/>
+          <v:rect id="_x0000_i1028" style="width:0;height:1.5pt" o:hralign="center" o:hrstd="t" o:hr="t" fillcolor="#a0a0a0" stroked="f"/>
         </w:pict>
       </w:r>
     </w:p>
@@ -2423,7 +2423,7 @@
     <w:p>
       <w:r>
         <w:pict w14:anchorId="0FE40355">
-          <v:rect id="_x0000_i1197" style="width:0;height:1.5pt" o:hralign="center" o:hrstd="t" o:hr="t" fillcolor="#a0a0a0" stroked="f"/>
+          <v:rect id="_x0000_i1029" style="width:0;height:1.5pt" o:hralign="center" o:hrstd="t" o:hr="t" fillcolor="#a0a0a0" stroked="f"/>
         </w:pict>
       </w:r>
     </w:p>
@@ -2450,7 +2450,7 @@
     <w:p>
       <w:r>
         <w:pict w14:anchorId="396091D8">
-          <v:rect id="_x0000_i1198" style="width:0;height:1.5pt" o:hralign="center" o:hrstd="t" o:hr="t" fillcolor="#a0a0a0" stroked="f"/>
+          <v:rect id="_x0000_i1030" style="width:0;height:1.5pt" o:hralign="center" o:hrstd="t" o:hr="t" fillcolor="#a0a0a0" stroked="f"/>
         </w:pict>
       </w:r>
     </w:p>
@@ -2491,7 +2491,7 @@
     <w:p>
       <w:r>
         <w:pict w14:anchorId="48C7EDA0">
-          <v:rect id="_x0000_i1199" style="width:0;height:1.5pt" o:hralign="center" o:hrstd="t" o:hr="t" fillcolor="#a0a0a0" stroked="f"/>
+          <v:rect id="_x0000_i1031" style="width:0;height:1.5pt" o:hralign="center" o:hrstd="t" o:hr="t" fillcolor="#a0a0a0" stroked="f"/>
         </w:pict>
       </w:r>
     </w:p>
@@ -2540,7 +2540,7 @@
       <w:r>
         <w:lastRenderedPageBreak/>
         <w:pict w14:anchorId="38F3EB04">
-          <v:rect id="_x0000_i1200" style="width:0;height:1.5pt" o:hralign="center" o:hrstd="t" o:hr="t" fillcolor="#a0a0a0" stroked="f"/>
+          <v:rect id="_x0000_i1032" style="width:0;height:1.5pt" o:hralign="center" o:hrstd="t" o:hr="t" fillcolor="#a0a0a0" stroked="f"/>
         </w:pict>
       </w:r>
     </w:p>
@@ -2627,7 +2627,7 @@
     <w:p>
       <w:r>
         <w:pict w14:anchorId="008BD4C5">
-          <v:rect id="_x0000_i1201" style="width:0;height:1.5pt" o:hralign="center" o:hrstd="t" o:hr="t" fillcolor="#a0a0a0" stroked="f"/>
+          <v:rect id="_x0000_i1033" style="width:0;height:1.5pt" o:hralign="center" o:hrstd="t" o:hr="t" fillcolor="#a0a0a0" stroked="f"/>
         </w:pict>
       </w:r>
     </w:p>
@@ -2658,7 +2658,7 @@
     <w:p>
       <w:r>
         <w:pict w14:anchorId="0F6E34A7">
-          <v:rect id="_x0000_i1202" style="width:0;height:1.5pt" o:hralign="center" o:hrstd="t" o:hr="t" fillcolor="#a0a0a0" stroked="f"/>
+          <v:rect id="_x0000_i1034" style="width:0;height:1.5pt" o:hralign="center" o:hrstd="t" o:hr="t" fillcolor="#a0a0a0" stroked="f"/>
         </w:pict>
       </w:r>
     </w:p>
@@ -2732,7 +2732,7 @@
     <w:p>
       <w:r>
         <w:pict w14:anchorId="11E6AF28">
-          <v:rect id="_x0000_i1203" style="width:0;height:1.5pt" o:hralign="center" o:hrstd="t" o:hr="t" fillcolor="#a0a0a0" stroked="f"/>
+          <v:rect id="_x0000_i1035" style="width:0;height:1.5pt" o:hralign="center" o:hrstd="t" o:hr="t" fillcolor="#a0a0a0" stroked="f"/>
         </w:pict>
       </w:r>
     </w:p>
@@ -2759,7 +2759,7 @@
     <w:p>
       <w:r>
         <w:pict w14:anchorId="59DA5142">
-          <v:rect id="_x0000_i1204" style="width:0;height:1.5pt" o:hralign="center" o:hrstd="t" o:hr="t" fillcolor="#a0a0a0" stroked="f"/>
+          <v:rect id="_x0000_i1036" style="width:0;height:1.5pt" o:hralign="center" o:hrstd="t" o:hr="t" fillcolor="#a0a0a0" stroked="f"/>
         </w:pict>
       </w:r>
     </w:p>
@@ -2786,7 +2786,7 @@
     <w:p>
       <w:r>
         <w:pict w14:anchorId="276C2A41">
-          <v:rect id="_x0000_i1205" style="width:0;height:1.5pt" o:hralign="center" o:hrstd="t" o:hr="t" fillcolor="#a0a0a0" stroked="f"/>
+          <v:rect id="_x0000_i1037" style="width:0;height:1.5pt" o:hralign="center" o:hrstd="t" o:hr="t" fillcolor="#a0a0a0" stroked="f"/>
         </w:pict>
       </w:r>
     </w:p>
@@ -2817,7 +2817,7 @@
     <w:p>
       <w:r>
         <w:pict w14:anchorId="7B9DD687">
-          <v:rect id="_x0000_i1206" style="width:0;height:1.5pt" o:hralign="center" o:hrstd="t" o:hr="t" fillcolor="#a0a0a0" stroked="f"/>
+          <v:rect id="_x0000_i1038" style="width:0;height:1.5pt" o:hralign="center" o:hrstd="t" o:hr="t" fillcolor="#a0a0a0" stroked="f"/>
         </w:pict>
       </w:r>
     </w:p>
@@ -2849,7 +2849,7 @@
     <w:p>
       <w:r>
         <w:pict w14:anchorId="713BEDDA">
-          <v:rect id="_x0000_i1207" style="width:0;height:1.5pt" o:hralign="center" o:hrstd="t" o:hr="t" fillcolor="#a0a0a0" stroked="f"/>
+          <v:rect id="_x0000_i1039" style="width:0;height:1.5pt" o:hralign="center" o:hrstd="t" o:hr="t" fillcolor="#a0a0a0" stroked="f"/>
         </w:pict>
       </w:r>
     </w:p>
@@ -2896,7 +2896,7 @@
     <w:p>
       <w:r>
         <w:pict w14:anchorId="2320CB4B">
-          <v:rect id="_x0000_i1208" style="width:0;height:1.5pt" o:hralign="center" o:hrstd="t" o:hr="t" fillcolor="#a0a0a0" stroked="f"/>
+          <v:rect id="_x0000_i1040" style="width:0;height:1.5pt" o:hralign="center" o:hrstd="t" o:hr="t" fillcolor="#a0a0a0" stroked="f"/>
         </w:pict>
       </w:r>
     </w:p>
@@ -2956,7 +2956,7 @@
     <w:p>
       <w:r>
         <w:pict w14:anchorId="3C23C2E7">
-          <v:rect id="_x0000_i1209" style="width:0;height:1.5pt" o:hralign="center" o:hrstd="t" o:hr="t" fillcolor="#a0a0a0" stroked="f"/>
+          <v:rect id="_x0000_i1041" style="width:0;height:1.5pt" o:hralign="center" o:hrstd="t" o:hr="t" fillcolor="#a0a0a0" stroked="f"/>
         </w:pict>
       </w:r>
     </w:p>
@@ -2994,7 +2994,7 @@
     <w:p>
       <w:r>
         <w:pict w14:anchorId="42F8FCC6">
-          <v:rect id="_x0000_i1210" style="width:0;height:1.5pt" o:hralign="center" o:hrstd="t" o:hr="t" fillcolor="#a0a0a0" stroked="f"/>
+          <v:rect id="_x0000_i1042" style="width:0;height:1.5pt" o:hralign="center" o:hrstd="t" o:hr="t" fillcolor="#a0a0a0" stroked="f"/>
         </w:pict>
       </w:r>
     </w:p>
@@ -3051,7 +3051,7 @@
     <w:p>
       <w:r>
         <w:pict w14:anchorId="6505FE23">
-          <v:rect id="_x0000_i1211" style="width:0;height:1.5pt" o:hralign="center" o:hrstd="t" o:hr="t" fillcolor="#a0a0a0" stroked="f"/>
+          <v:rect id="_x0000_i1043" style="width:0;height:1.5pt" o:hralign="center" o:hrstd="t" o:hr="t" fillcolor="#a0a0a0" stroked="f"/>
         </w:pict>
       </w:r>
     </w:p>
@@ -3086,7 +3086,7 @@
     <w:p>
       <w:r>
         <w:pict w14:anchorId="31F3661F">
-          <v:rect id="_x0000_i1212" style="width:0;height:1.5pt" o:hralign="center" o:hrstd="t" o:hr="t" fillcolor="#a0a0a0" stroked="f"/>
+          <v:rect id="_x0000_i1044" style="width:0;height:1.5pt" o:hralign="center" o:hrstd="t" o:hr="t" fillcolor="#a0a0a0" stroked="f"/>
         </w:pict>
       </w:r>
     </w:p>
@@ -3113,7 +3113,7 @@
     <w:p>
       <w:r>
         <w:pict w14:anchorId="61A19232">
-          <v:rect id="_x0000_i1213" style="width:0;height:1.5pt" o:hralign="center" o:hrstd="t" o:hr="t" fillcolor="#a0a0a0" stroked="f"/>
+          <v:rect id="_x0000_i1045" style="width:0;height:1.5pt" o:hralign="center" o:hrstd="t" o:hr="t" fillcolor="#a0a0a0" stroked="f"/>
         </w:pict>
       </w:r>
     </w:p>
@@ -3186,7 +3186,7 @@
     <w:p>
       <w:r>
         <w:pict w14:anchorId="0E726754">
-          <v:rect id="_x0000_i1214" style="width:0;height:1.5pt" o:hralign="center" o:hrstd="t" o:hr="t" fillcolor="#a0a0a0" stroked="f"/>
+          <v:rect id="_x0000_i1046" style="width:0;height:1.5pt" o:hralign="center" o:hrstd="t" o:hr="t" fillcolor="#a0a0a0" stroked="f"/>
         </w:pict>
       </w:r>
     </w:p>
@@ -3244,7 +3244,7 @@
     <w:p>
       <w:r>
         <w:pict w14:anchorId="55F2A8DA">
-          <v:rect id="_x0000_i1215" style="width:0;height:1.5pt" o:hralign="center" o:hrstd="t" o:hr="t" fillcolor="#a0a0a0" stroked="f"/>
+          <v:rect id="_x0000_i1047" style="width:0;height:1.5pt" o:hralign="center" o:hrstd="t" o:hr="t" fillcolor="#a0a0a0" stroked="f"/>
         </w:pict>
       </w:r>
     </w:p>
@@ -3308,7 +3308,7 @@
     <w:p>
       <w:r>
         <w:pict w14:anchorId="59449AE5">
-          <v:rect id="_x0000_i1216" style="width:0;height:1.5pt" o:hralign="center" o:hrstd="t" o:hr="t" fillcolor="#a0a0a0" stroked="f"/>
+          <v:rect id="_x0000_i1048" style="width:0;height:1.5pt" o:hralign="center" o:hrstd="t" o:hr="t" fillcolor="#a0a0a0" stroked="f"/>
         </w:pict>
       </w:r>
     </w:p>
@@ -3420,7 +3420,7 @@
     <w:p>
       <w:r>
         <w:pict w14:anchorId="37F72C04">
-          <v:rect id="_x0000_i1217" style="width:0;height:1.5pt" o:hralign="center" o:hrstd="t" o:hr="t" fillcolor="#a0a0a0" stroked="f"/>
+          <v:rect id="_x0000_i1049" style="width:0;height:1.5pt" o:hralign="center" o:hrstd="t" o:hr="t" fillcolor="#a0a0a0" stroked="f"/>
         </w:pict>
       </w:r>
     </w:p>
@@ -3477,7 +3477,7 @@
     <w:p>
       <w:r>
         <w:pict w14:anchorId="206073B7">
-          <v:rect id="_x0000_i1218" style="width:0;height:1.5pt" o:hralign="center" o:hrstd="t" o:hr="t" fillcolor="#a0a0a0" stroked="f"/>
+          <v:rect id="_x0000_i1050" style="width:0;height:1.5pt" o:hralign="center" o:hrstd="t" o:hr="t" fillcolor="#a0a0a0" stroked="f"/>
         </w:pict>
       </w:r>
     </w:p>
@@ -3517,7 +3517,7 @@
     <w:p>
       <w:r>
         <w:pict w14:anchorId="2F43FA4A">
-          <v:rect id="_x0000_i1219" style="width:0;height:1.5pt" o:hralign="center" o:hrstd="t" o:hr="t" fillcolor="#a0a0a0" stroked="f"/>
+          <v:rect id="_x0000_i1051" style="width:0;height:1.5pt" o:hralign="center" o:hrstd="t" o:hr="t" fillcolor="#a0a0a0" stroked="f"/>
         </w:pict>
       </w:r>
     </w:p>
@@ -3557,7 +3557,7 @@
     <w:p>
       <w:r>
         <w:pict w14:anchorId="5DE5B54F">
-          <v:rect id="_x0000_i1220" style="width:0;height:1.5pt" o:hralign="center" o:hrstd="t" o:hr="t" fillcolor="#a0a0a0" stroked="f"/>
+          <v:rect id="_x0000_i1052" style="width:0;height:1.5pt" o:hralign="center" o:hrstd="t" o:hr="t" fillcolor="#a0a0a0" stroked="f"/>
         </w:pict>
       </w:r>
     </w:p>
@@ -3673,6 +3673,158 @@
     <w:p>
       <w:r>
         <w:t>Sau đó chạy toàn bộ quy trình trên để đánh giá xem giao diện và luồng xử lý hiện tại của v4.1 còn thiếu bước nghiệp vụ nào so với thực tế tại NHCSXH. Đây sẽ là đầu vào rất giá trị cho giai đoạn UAT và Production Hardening (v4.2).</w:t>
+      </w:r>
+    </w:p>
+    <w:p/>
+    <w:p>
+      <w:pPr>
+        <w:rPr>
+          <w:b/>
+          <w:bCs/>
+        </w:rPr>
+      </w:pPr>
+      <w:r>
+        <w:rPr>
+          <w:b/>
+          <w:bCs/>
+        </w:rPr>
+        <w:t>Quy trình tạo hồ sơ cấp độ theo mẫu biểu quy định</w:t>
+      </w:r>
+    </w:p>
+    <w:p>
+      <w:r>
+        <w:t>Khi cán bộ ATTT chọn:</w:t>
+      </w:r>
+    </w:p>
+    <w:p>
+      <w:r>
+        <w:t>Core Banking</w:t>
+      </w:r>
+    </w:p>
+    <w:p>
+      <w:r>
+        <w:t>và bấm:</w:t>
+      </w:r>
+    </w:p>
+    <w:p>
+      <w:r>
+        <w:t>Sinh bộ hồ sơ cấp độ</w:t>
+      </w:r>
+    </w:p>
+    <w:p>
+      <w:r>
+        <w:t>hệ thống sẽ tạo:</w:t>
+      </w:r>
+    </w:p>
+    <w:p>
+      <w:r>
+        <w:t>HSCD-CoreBanking.zip</w:t>
+      </w:r>
+    </w:p>
+    <w:p>
+      <w:r>
+        <w:t>gồm đầy đủ:</w:t>
+      </w:r>
+    </w:p>
+    <w:p>
+      <w:r>
+        <w:rPr>
+          <w:rFonts w:ascii="Segoe UI Symbol" w:hAnsi="Segoe UI Symbol" w:cs="Segoe UI Symbol"/>
+        </w:rPr>
+        <w:t>✔</w:t>
+      </w:r>
+      <w:r>
+        <w:t xml:space="preserve"> Tờ trình</w:t>
+      </w:r>
+      <w:r>
+        <w:br/>
+      </w:r>
+      <w:r>
+        <w:br/>
+      </w:r>
+      <w:r>
+        <w:rPr>
+          <w:rFonts w:ascii="Segoe UI Symbol" w:hAnsi="Segoe UI Symbol" w:cs="Segoe UI Symbol"/>
+        </w:rPr>
+        <w:t>✔</w:t>
+      </w:r>
+      <w:r>
+        <w:t xml:space="preserve"> Hồ sơ đề xuất cấp độ</w:t>
+      </w:r>
+      <w:r>
+        <w:br/>
+      </w:r>
+      <w:r>
+        <w:br/>
+      </w:r>
+      <w:r>
+        <w:rPr>
+          <w:rFonts w:ascii="Segoe UI Symbol" w:hAnsi="Segoe UI Symbol" w:cs="Segoe UI Symbol"/>
+        </w:rPr>
+        <w:t>✔</w:t>
+      </w:r>
+      <w:r>
+        <w:t xml:space="preserve"> V</w:t>
+      </w:r>
+      <w:r>
+        <w:rPr>
+          <w:rFonts w:ascii="Calibri" w:hAnsi="Calibri" w:cs="Calibri"/>
+        </w:rPr>
+        <w:t>ă</w:t>
+      </w:r>
+      <w:r>
+        <w:t>n bản xin ý kiến</w:t>
+      </w:r>
+      <w:r>
+        <w:br/>
+      </w:r>
+      <w:r>
+        <w:br/>
+      </w:r>
+      <w:r>
+        <w:rPr>
+          <w:rFonts w:ascii="Segoe UI Symbol" w:hAnsi="Segoe UI Symbol" w:cs="Segoe UI Symbol"/>
+        </w:rPr>
+        <w:t>✔</w:t>
+      </w:r>
+      <w:r>
+        <w:t xml:space="preserve"> Quyết định</w:t>
+      </w:r>
+      <w:r>
+        <w:br/>
+      </w:r>
+      <w:r>
+        <w:lastRenderedPageBreak/>
+        <w:br/>
+      </w:r>
+      <w:r>
+        <w:rPr>
+          <w:rFonts w:ascii="Segoe UI Symbol" w:hAnsi="Segoe UI Symbol" w:cs="Segoe UI Symbol"/>
+        </w:rPr>
+        <w:t>✔</w:t>
+      </w:r>
+      <w:r>
+        <w:t xml:space="preserve"> Checklist</w:t>
+      </w:r>
+      <w:r>
+        <w:br/>
+      </w:r>
+      <w:r>
+        <w:br/>
+      </w:r>
+      <w:r>
+        <w:rPr>
+          <w:rFonts w:ascii="Segoe UI Symbol" w:hAnsi="Segoe UI Symbol" w:cs="Segoe UI Symbol"/>
+        </w:rPr>
+        <w:t>✔</w:t>
+      </w:r>
+      <w:r>
+        <w:t xml:space="preserve"> Minh chứng</w:t>
+      </w:r>
+    </w:p>
+    <w:p>
+      <w:r>
+        <w:t>để phục vụ hoàn thiện hồ sơ cấp độ thực tế.</w:t>
       </w:r>
     </w:p>
     <w:p/>
@@ -3684,6 +3836,126 @@
     </w:sectPr>
   </w:body>
 </w:document>
+</file>
+
+<file path=word/numbering.xml><?xml version="1.0" encoding="utf-8"?>
+<w:numbering xmlns:wpc="http://schemas.microsoft.com/office/word/2010/wordprocessingCanvas" xmlns:cx="http://schemas.microsoft.com/office/drawing/2014/chartex" xmlns:cx1="http://schemas.microsoft.com/office/drawing/2015/9/8/chartex" xmlns:cx2="http://schemas.microsoft.com/office/drawing/2015/10/21/chartex" xmlns:cx3="http://schemas.microsoft.com/office/drawing/2016/5/9/chartex" xmlns:cx4="http://schemas.microsoft.com/office/drawing/2016/5/10/chartex" xmlns:cx5="http://schemas.microsoft.com/office/drawing/2016/5/11/chartex" xmlns:cx6="http://schemas.microsoft.com/office/drawing/2016/5/12/chartex" xmlns:cx7="http://schemas.microsoft.com/office/drawing/2016/5/13/chartex" xmlns:cx8="http://schemas.microsoft.com/office/drawing/2016/5/14/chartex" xmlns:mc="http://schemas.openxmlformats.org/markup-compatibility/2006" xmlns:aink="http://schemas.microsoft.com/office/drawing/2016/ink" xmlns:am3d="http://schemas.microsoft.com/office/drawing/2017/model3d" xmlns:o="urn:schemas-microsoft-com:office:office" xmlns:oel="http://schemas.microsoft.com/office/2019/extlst" xmlns:r="http://schemas.openxmlformats.org/officeDocument/2006/relationships" xmlns:m="http://schemas.openxmlformats.org/officeDocument/2006/math" xmlns:v="urn:schemas-microsoft-com:vml" xmlns:wp14="http://schemas.microsoft.com/office/word/2010/wordprocessingDrawing" xmlns:wp="http://schemas.openxmlformats.org/drawingml/2006/wordprocessingDrawing" xmlns:w10="urn:schemas-microsoft-com:office:word" xmlns:w="http://schemas.openxmlformats.org/wordprocessingml/2006/main" xmlns:w14="http://schemas.microsoft.com/office/word/2010/wordml" xmlns:w15="http://schemas.microsoft.com/office/word/2012/wordml" xmlns:w16cex="http://schemas.microsoft.com/office/word/2018/wordml/cex" xmlns:w16cid="http://schemas.microsoft.com/office/word/2016/wordml/cid" xmlns:w16="http://schemas.microsoft.com/office/word/2018/wordml" xmlns:w16du="http://schemas.microsoft.com/office/word/2023/wordml/word16du" xmlns:w16sdtdh="http://schemas.microsoft.com/office/word/2020/wordml/sdtdatahash" xmlns:w16sdtfl="http://schemas.microsoft.com/office/word/2024/wordml/sdtformatlock" xmlns:w16se="http://schemas.microsoft.com/office/word/2015/wordml/symex" xmlns:wpg="http://schemas.microsoft.com/office/word/2010/wordprocessingGroup" xmlns:wpi="http://schemas.microsoft.com/office/word/2010/wordprocessingInk" xmlns:wne="http://schemas.microsoft.com/office/word/2006/wordml" xmlns:wps="http://schemas.microsoft.com/office/word/2010/wordprocessingShape" mc:Ignorable="w14 w15 w16se w16cid w16 w16cex w16sdtdh w16sdtfl w16du wp14">
+  <w:abstractNum w:abstractNumId="0" w15:restartNumberingAfterBreak="0">
+    <w:nsid w:val="39564A80"/>
+    <w:multiLevelType w:val="hybridMultilevel"/>
+    <w:tmpl w:val="591E35BA"/>
+    <w:lvl w:ilvl="0" w:tplc="BF887510">
+      <w:numFmt w:val="bullet"/>
+      <w:lvlText w:val=""/>
+      <w:lvlJc w:val="left"/>
+      <w:pPr>
+        <w:ind w:left="720" w:hanging="360"/>
+      </w:pPr>
+      <w:rPr>
+        <w:rFonts w:ascii="Wingdings" w:eastAsiaTheme="minorHAnsi" w:hAnsi="Wingdings" w:cstheme="minorBidi" w:hint="default"/>
+      </w:rPr>
+    </w:lvl>
+    <w:lvl w:ilvl="1" w:tplc="04090003" w:tentative="1">
+      <w:start w:val="1"/>
+      <w:numFmt w:val="bullet"/>
+      <w:lvlText w:val="o"/>
+      <w:lvlJc w:val="left"/>
+      <w:pPr>
+        <w:ind w:left="1440" w:hanging="360"/>
+      </w:pPr>
+      <w:rPr>
+        <w:rFonts w:ascii="Courier New" w:hAnsi="Courier New" w:cs="Courier New" w:hint="default"/>
+      </w:rPr>
+    </w:lvl>
+    <w:lvl w:ilvl="2" w:tplc="04090005" w:tentative="1">
+      <w:start w:val="1"/>
+      <w:numFmt w:val="bullet"/>
+      <w:lvlText w:val=""/>
+      <w:lvlJc w:val="left"/>
+      <w:pPr>
+        <w:ind w:left="2160" w:hanging="360"/>
+      </w:pPr>
+      <w:rPr>
+        <w:rFonts w:ascii="Wingdings" w:hAnsi="Wingdings" w:hint="default"/>
+      </w:rPr>
+    </w:lvl>
+    <w:lvl w:ilvl="3" w:tplc="04090001" w:tentative="1">
+      <w:start w:val="1"/>
+      <w:numFmt w:val="bullet"/>
+      <w:lvlText w:val=""/>
+      <w:lvlJc w:val="left"/>
+      <w:pPr>
+        <w:ind w:left="2880" w:hanging="360"/>
+      </w:pPr>
+      <w:rPr>
+        <w:rFonts w:ascii="Symbol" w:hAnsi="Symbol" w:hint="default"/>
+      </w:rPr>
+    </w:lvl>
+    <w:lvl w:ilvl="4" w:tplc="04090003" w:tentative="1">
+      <w:start w:val="1"/>
+      <w:numFmt w:val="bullet"/>
+      <w:lvlText w:val="o"/>
+      <w:lvlJc w:val="left"/>
+      <w:pPr>
+        <w:ind w:left="3600" w:hanging="360"/>
+      </w:pPr>
+      <w:rPr>
+        <w:rFonts w:ascii="Courier New" w:hAnsi="Courier New" w:cs="Courier New" w:hint="default"/>
+      </w:rPr>
+    </w:lvl>
+    <w:lvl w:ilvl="5" w:tplc="04090005" w:tentative="1">
+      <w:start w:val="1"/>
+      <w:numFmt w:val="bullet"/>
+      <w:lvlText w:val=""/>
+      <w:lvlJc w:val="left"/>
+      <w:pPr>
+        <w:ind w:left="4320" w:hanging="360"/>
+      </w:pPr>
+      <w:rPr>
+        <w:rFonts w:ascii="Wingdings" w:hAnsi="Wingdings" w:hint="default"/>
+      </w:rPr>
+    </w:lvl>
+    <w:lvl w:ilvl="6" w:tplc="04090001" w:tentative="1">
+      <w:start w:val="1"/>
+      <w:numFmt w:val="bullet"/>
+      <w:lvlText w:val=""/>
+      <w:lvlJc w:val="left"/>
+      <w:pPr>
+        <w:ind w:left="5040" w:hanging="360"/>
+      </w:pPr>
+      <w:rPr>
+        <w:rFonts w:ascii="Symbol" w:hAnsi="Symbol" w:hint="default"/>
+      </w:rPr>
+    </w:lvl>
+    <w:lvl w:ilvl="7" w:tplc="04090003" w:tentative="1">
+      <w:start w:val="1"/>
+      <w:numFmt w:val="bullet"/>
+      <w:lvlText w:val="o"/>
+      <w:lvlJc w:val="left"/>
+      <w:pPr>
+        <w:ind w:left="5760" w:hanging="360"/>
+      </w:pPr>
+      <w:rPr>
+        <w:rFonts w:ascii="Courier New" w:hAnsi="Courier New" w:cs="Courier New" w:hint="default"/>
+      </w:rPr>
+    </w:lvl>
+    <w:lvl w:ilvl="8" w:tplc="04090005" w:tentative="1">
+      <w:start w:val="1"/>
+      <w:numFmt w:val="bullet"/>
+      <w:lvlText w:val=""/>
+      <w:lvlJc w:val="left"/>
+      <w:pPr>
+        <w:ind w:left="6480" w:hanging="360"/>
+      </w:pPr>
+      <w:rPr>
+        <w:rFonts w:ascii="Wingdings" w:hAnsi="Wingdings" w:hint="default"/>
+      </w:rPr>
+    </w:lvl>
+  </w:abstractNum>
+  <w:num w:numId="1" w16cid:durableId="6837993">
+    <w:abstractNumId w:val="0"/>
+  </w:num>
+</w:numbering>
 </file>
 
 <file path=word/styles.xml><?xml version="1.0" encoding="utf-8"?>

</xml_diff>